<commit_message>
Radkovani o 15 % mensi i v protokolu, dodatku a obecnych dokumentech; protokol s okraji jako smlouva
Co-Authored-By: Claude Opus 5.5 <noreply@anthropic.com>
</commit_message>
<xml_diff>
--- a/public/templates/dodatek_sablona.docx
+++ b/public/templates/dodatek_sablona.docx
@@ -4,7 +4,7 @@
   <w:body>
     <w:p>
       <w:pPr>
-        <w:spacing w:before="0" w:after="0" w:line="264" w:lineRule="auto"/>
+        <w:spacing w:before="0" w:after="0" w:line="224" w:lineRule="auto"/>
         <w:jc w:val="center"/>
       </w:pPr>
       <w:r>
@@ -21,7 +21,7 @@
     </w:p>
     <w:p>
       <w:pPr>
-        <w:spacing w:before="0" w:after="240" w:line="264" w:lineRule="auto"/>
+        <w:spacing w:before="0" w:after="204" w:line="224" w:lineRule="auto"/>
         <w:jc w:val="center"/>
       </w:pPr>
       <w:r>
@@ -39,7 +39,7 @@
     <w:p>
       <w:pPr>
         <w:keepNext/>
-        <w:spacing w:before="240" w:after="80" w:line="264" w:lineRule="auto"/>
+        <w:spacing w:before="204" w:after="68" w:line="224" w:lineRule="auto"/>
       </w:pPr>
       <w:r>
         <w:rPr>
@@ -81,7 +81,7 @@
           </w:tcPr>
           <w:p>
             <w:pPr>
-              <w:spacing w:before="0" w:after="0" w:line="264" w:lineRule="auto"/>
+              <w:spacing w:before="0" w:after="0" w:line="224" w:lineRule="auto"/>
             </w:pPr>
             <w:r>
               <w:rPr>
@@ -119,7 +119,7 @@
           </w:tcPr>
           <w:p>
             <w:pPr>
-              <w:spacing w:before="0" w:after="0" w:line="264" w:lineRule="auto"/>
+              <w:spacing w:before="0" w:after="0" w:line="224" w:lineRule="auto"/>
             </w:pPr>
             <w:r>
               <w:rPr>
@@ -156,7 +156,7 @@
     <w:p>
       <w:pPr>
         <w:keepNext/>
-        <w:spacing w:before="240" w:after="80" w:line="264" w:lineRule="auto"/>
+        <w:spacing w:before="204" w:after="68" w:line="224" w:lineRule="auto"/>
       </w:pPr>
       <w:r>
         <w:rPr>
@@ -172,7 +172,7 @@
     </w:p>
     <w:p>
       <w:pPr>
-        <w:spacing w:before="0" w:after="120" w:line="264" w:lineRule="auto"/>
+        <w:spacing w:before="0" w:after="102" w:line="224" w:lineRule="auto"/>
       </w:pPr>
       <w:r>
         <w:rPr>
@@ -185,7 +185,7 @@
     </w:p>
     <w:p>
       <w:pPr>
-        <w:spacing w:before="0" w:after="200" w:line="264" w:lineRule="auto"/>
+        <w:spacing w:before="0" w:after="170" w:line="224" w:lineRule="auto"/>
         <w:pBdr>
           <w:top w:val="single" w:sz="4" w:space="4" w:color="999999"/>
           <w:left w:val="single" w:sz="4" w:space="4" w:color="999999"/>
@@ -204,7 +204,7 @@
     </w:p>
     <w:p>
       <w:pPr>
-        <w:spacing w:before="0" w:after="0" w:line="264" w:lineRule="auto"/>
+        <w:spacing w:before="0" w:after="0" w:line="224" w:lineRule="auto"/>
       </w:pPr>
       <w:r>
         <w:rPr>
@@ -218,7 +218,7 @@
     <w:p>
       <w:pPr>
         <w:keepNext/>
-        <w:spacing w:before="120" w:after="80" w:line="264" w:lineRule="auto"/>
+        <w:spacing w:before="102" w:after="68" w:line="224" w:lineRule="auto"/>
       </w:pPr>
       <w:r>
         <w:rPr>
@@ -233,7 +233,7 @@
     </w:p>
     <w:p>
       <w:pPr>
-        <w:spacing w:before="0" w:after="200" w:line="264" w:lineRule="auto"/>
+        <w:spacing w:before="0" w:after="170" w:line="224" w:lineRule="auto"/>
       </w:pPr>
       <w:r>
         <w:rPr>
@@ -246,7 +246,7 @@
     </w:p>
     <w:p>
       <w:pPr>
-        <w:spacing w:before="0" w:after="0" w:line="264" w:lineRule="auto"/>
+        <w:spacing w:before="0" w:after="0" w:line="224" w:lineRule="auto"/>
       </w:pPr>
       <w:r>
         <w:rPr>
@@ -260,7 +260,7 @@
     <w:p>
       <w:pPr>
         <w:keepNext/>
-        <w:spacing w:before="240" w:after="80" w:line="264" w:lineRule="auto"/>
+        <w:spacing w:before="204" w:after="68" w:line="224" w:lineRule="auto"/>
       </w:pPr>
       <w:r>
         <w:rPr>
@@ -276,7 +276,7 @@
     </w:p>
     <w:p>
       <w:pPr>
-        <w:spacing w:before="0" w:after="0" w:line="264" w:lineRule="auto"/>
+        <w:spacing w:before="0" w:after="0" w:line="224" w:lineRule="auto"/>
       </w:pPr>
       <w:r>
         <w:rPr>
@@ -315,7 +315,7 @@
           </w:tcPr>
           <w:p>
             <w:pPr>
-              <w:spacing w:before="40" w:after="40" w:line="264" w:lineRule="auto"/>
+              <w:spacing w:before="34" w:after="34" w:line="224" w:lineRule="auto"/>
             </w:pPr>
             <w:r>
               <w:rPr>
@@ -335,7 +335,7 @@
           </w:tcPr>
           <w:p>
             <w:pPr>
-              <w:spacing w:before="40" w:after="40" w:line="264" w:lineRule="auto"/>
+              <w:spacing w:before="34" w:after="34" w:line="224" w:lineRule="auto"/>
             </w:pPr>
             <w:r>
               <w:rPr>
@@ -355,7 +355,7 @@
           </w:tcPr>
           <w:p>
             <w:pPr>
-              <w:spacing w:before="40" w:after="40" w:line="264" w:lineRule="auto"/>
+              <w:spacing w:before="34" w:after="34" w:line="224" w:lineRule="auto"/>
             </w:pPr>
             <w:r>
               <w:rPr>
@@ -375,7 +375,7 @@
           </w:tcPr>
           <w:p>
             <w:pPr>
-              <w:spacing w:before="40" w:after="40" w:line="264" w:lineRule="auto"/>
+              <w:spacing w:before="34" w:after="34" w:line="224" w:lineRule="auto"/>
             </w:pPr>
             <w:r>
               <w:rPr>
@@ -397,7 +397,7 @@
           </w:tcPr>
           <w:p>
             <w:pPr>
-              <w:spacing w:before="40" w:after="40" w:line="264" w:lineRule="auto"/>
+              <w:spacing w:before="34" w:after="34" w:line="224" w:lineRule="auto"/>
             </w:pPr>
             <w:r>
               <w:rPr>
@@ -417,7 +417,7 @@
           </w:tcPr>
           <w:p>
             <w:pPr>
-              <w:spacing w:before="40" w:after="40" w:line="264" w:lineRule="auto"/>
+              <w:spacing w:before="34" w:after="34" w:line="224" w:lineRule="auto"/>
             </w:pPr>
             <w:r>
               <w:rPr>
@@ -433,7 +433,7 @@
     </w:tbl>
     <w:p>
       <w:pPr>
-        <w:spacing w:before="80" w:after="120" w:line="264" w:lineRule="auto"/>
+        <w:spacing w:before="68" w:after="102" w:line="224" w:lineRule="auto"/>
       </w:pPr>
       <w:r>
         <w:rPr>
@@ -446,7 +446,7 @@
     </w:p>
     <w:p>
       <w:pPr>
-        <w:spacing w:before="0" w:after="0" w:line="264" w:lineRule="auto"/>
+        <w:spacing w:before="0" w:after="0" w:line="224" w:lineRule="auto"/>
       </w:pPr>
       <w:r>
         <w:rPr>
@@ -459,7 +459,7 @@
     </w:p>
     <w:p>
       <w:pPr>
-        <w:spacing w:before="0" w:after="120" w:line="264" w:lineRule="auto"/>
+        <w:spacing w:before="0" w:after="102" w:line="224" w:lineRule="auto"/>
       </w:pPr>
       <w:r>
         <w:rPr>
@@ -473,7 +473,7 @@
     <w:p>
       <w:pPr>
         <w:keepNext/>
-        <w:spacing w:before="240" w:after="80" w:line="264" w:lineRule="auto"/>
+        <w:spacing w:before="204" w:after="68" w:line="224" w:lineRule="auto"/>
       </w:pPr>
       <w:r>
         <w:rPr>
@@ -489,7 +489,7 @@
     </w:p>
     <w:p>
       <w:pPr>
-        <w:spacing w:before="0" w:after="120" w:line="264" w:lineRule="auto"/>
+        <w:spacing w:before="0" w:after="102" w:line="224" w:lineRule="auto"/>
       </w:pPr>
       <w:r>
         <w:rPr>
@@ -521,7 +521,7 @@
     <w:p>
       <w:pPr>
         <w:keepNext/>
-        <w:spacing w:before="240" w:after="80" w:line="264" w:lineRule="auto"/>
+        <w:spacing w:before="204" w:after="68" w:line="224" w:lineRule="auto"/>
       </w:pPr>
       <w:r>
         <w:rPr>
@@ -537,7 +537,7 @@
     </w:p>
     <w:p>
       <w:pPr>
-        <w:spacing w:before="0" w:after="120" w:line="264" w:lineRule="auto"/>
+        <w:spacing w:before="0" w:after="102" w:line="224" w:lineRule="auto"/>
       </w:pPr>
       <w:r>
         <w:rPr>
@@ -551,7 +551,7 @@
     <w:p>
       <w:pPr>
         <w:keepNext/>
-        <w:spacing w:before="240" w:after="960" w:line="264" w:lineRule="auto"/>
+        <w:spacing w:before="204" w:after="816" w:line="224" w:lineRule="auto"/>
       </w:pPr>
       <w:r>
         <w:rPr>
@@ -590,7 +590,7 @@
           </w:tcPr>
           <w:p>
             <w:pPr>
-              <w:spacing w:before="0" w:after="0" w:line="264" w:lineRule="auto"/>
+              <w:spacing w:before="0" w:after="0" w:line="224" w:lineRule="auto"/>
               <w:jc w:val="center"/>
             </w:pPr>
             <w:r>
@@ -611,7 +611,7 @@
           </w:tcPr>
           <w:p>
             <w:pPr>
-              <w:spacing w:before="0" w:after="0" w:line="264" w:lineRule="auto"/>
+              <w:spacing w:before="0" w:after="0" w:line="224" w:lineRule="auto"/>
             </w:pPr>
           </w:p>
         </w:tc>
@@ -624,7 +624,7 @@
           </w:tcPr>
           <w:p>
             <w:pPr>
-              <w:spacing w:before="0" w:after="0" w:line="264" w:lineRule="auto"/>
+              <w:spacing w:before="0" w:after="0" w:line="224" w:lineRule="auto"/>
               <w:jc w:val="center"/>
             </w:pPr>
             <w:r>
@@ -1585,7 +1585,7 @@
     </w:rPrDefault>
     <w:pPrDefault>
       <w:pPr>
-        <w:spacing w:after="160" w:line="259" w:lineRule="auto"/>
+        <w:spacing w:after="136" w:line="220" w:lineRule="auto"/>
       </w:pPr>
     </w:pPrDefault>
   </w:docDefaults>
@@ -1983,7 +1983,7 @@
     <w:pPr>
       <w:keepNext/>
       <w:keepLines/>
-      <w:spacing w:before="360" w:after="120" w:line="240" w:lineRule="atLeast"/>
+      <w:spacing w:before="306" w:after="102" w:line="204" w:lineRule="auto"/>
       <w:outlineLvl w:val="1"/>
     </w:pPr>
     <w:rPr>
@@ -2035,7 +2035,7 @@
         <w:tab w:val="center" w:pos="4536"/>
         <w:tab w:val="right" w:pos="9072"/>
       </w:tabs>
-      <w:spacing w:after="0" w:line="192" w:lineRule="atLeast"/>
+      <w:spacing w:after="0" w:line="163" w:lineRule="auto"/>
     </w:pPr>
     <w:rPr>
       <w:rFonts w:eastAsiaTheme="minorHAnsi"/>
@@ -2071,7 +2071,7 @@
         <w:tab w:val="center" w:pos="4536"/>
         <w:tab w:val="right" w:pos="9072"/>
       </w:tabs>
-      <w:spacing w:after="0" w:line="240" w:lineRule="auto"/>
+      <w:spacing w:after="0" w:line="204" w:lineRule="auto"/>
     </w:pPr>
     <w:rPr>
       <w:rFonts w:eastAsiaTheme="minorHAnsi"/>
@@ -2107,7 +2107,7 @@
       <w:numPr>
         <w:numId w:val="1"/>
       </w:numPr>
-      <w:spacing w:after="120" w:line="240" w:lineRule="atLeast"/>
+      <w:spacing w:after="102" w:line="204" w:lineRule="auto"/>
     </w:pPr>
     <w:rPr>
       <w:rFonts w:eastAsiaTheme="minorHAnsi"/>
@@ -2123,7 +2123,7 @@
     <w:uiPriority w:val="39"/>
     <w:rsid w:val="00BE5539"/>
     <w:pPr>
-      <w:spacing w:after="0" w:line="240" w:lineRule="auto"/>
+      <w:spacing w:after="0" w:line="204" w:lineRule="auto"/>
     </w:pPr>
     <w:rPr>
       <w:rFonts w:eastAsiaTheme="minorHAnsi"/>
@@ -2154,7 +2154,7 @@
       <w:numPr>
         <w:numId w:val="2"/>
       </w:numPr>
-      <w:spacing w:before="360" w:after="120" w:line="240" w:lineRule="atLeast"/>
+      <w:spacing w:before="306" w:after="102" w:line="204" w:lineRule="auto"/>
       <w:jc w:val="center"/>
     </w:pPr>
     <w:rPr>
@@ -2177,7 +2177,7 @@
         <w:ilvl w:val="1"/>
         <w:numId w:val="2"/>
       </w:numPr>
-      <w:spacing w:after="120" w:line="240" w:lineRule="atLeast"/>
+      <w:spacing w:after="102" w:line="204" w:lineRule="auto"/>
     </w:pPr>
     <w:rPr>
       <w:rFonts w:ascii="Tahoma" w:eastAsiaTheme="minorHAnsi" w:hAnsi="Tahoma"/>
@@ -2198,7 +2198,7 @@
         <w:ilvl w:val="2"/>
         <w:numId w:val="2"/>
       </w:numPr>
-      <w:spacing w:after="120" w:line="240" w:lineRule="atLeast"/>
+      <w:spacing w:after="102" w:line="204" w:lineRule="auto"/>
     </w:pPr>
     <w:rPr>
       <w:rFonts w:ascii="Tahoma" w:eastAsiaTheme="minorHAnsi" w:hAnsi="Tahoma"/>
@@ -2219,7 +2219,7 @@
         <w:ilvl w:val="3"/>
         <w:numId w:val="2"/>
       </w:numPr>
-      <w:spacing w:after="120" w:line="240" w:lineRule="atLeast"/>
+      <w:spacing w:after="102" w:line="204" w:lineRule="auto"/>
     </w:pPr>
     <w:rPr>
       <w:rFonts w:eastAsiaTheme="minorHAnsi"/>
@@ -2239,7 +2239,7 @@
       <w:numPr>
         <w:numId w:val="3"/>
       </w:numPr>
-      <w:spacing w:after="120" w:line="240" w:lineRule="atLeast"/>
+      <w:spacing w:after="102" w:line="204" w:lineRule="auto"/>
     </w:pPr>
     <w:rPr>
       <w:rFonts w:eastAsiaTheme="minorHAnsi"/>
@@ -2255,7 +2255,7 @@
     <w:qFormat/>
     <w:rsid w:val="00BE5539"/>
     <w:pPr>
-      <w:spacing w:after="0" w:line="240" w:lineRule="atLeast"/>
+      <w:spacing w:after="0" w:line="204" w:lineRule="auto"/>
     </w:pPr>
     <w:rPr>
       <w:rFonts w:eastAsiaTheme="minorHAnsi"/>
@@ -2282,7 +2282,7 @@
     <w:semiHidden/>
     <w:rsid w:val="007E1B51"/>
     <w:pPr>
-      <w:spacing w:after="0" w:line="240" w:lineRule="auto"/>
+      <w:spacing w:after="0" w:line="204" w:lineRule="auto"/>
     </w:pPr>
   </w:style>
   <w:style w:type="character" w:styleId="Hypertextovodkaz">
@@ -2304,7 +2304,7 @@
     <w:unhideWhenUsed/>
     <w:rsid w:val="00B61DBF"/>
     <w:pPr>
-      <w:spacing w:before="100" w:beforeAutospacing="1" w:after="100" w:afterAutospacing="1" w:line="240" w:lineRule="auto"/>
+      <w:spacing w:before="85" w:beforeAutospacing="1" w:after="85" w:afterAutospacing="1" w:line="204" w:lineRule="auto"/>
     </w:pPr>
     <w:rPr>
       <w:rFonts w:ascii="Times New Roman" w:eastAsia="Times New Roman" w:hAnsi="Times New Roman" w:cs="Times New Roman"/>
@@ -2334,7 +2334,7 @@
     <w:unhideWhenUsed/>
     <w:rsid w:val="005126EB"/>
     <w:pPr>
-      <w:spacing w:line="240" w:lineRule="auto"/>
+      <w:spacing w:line="204" w:lineRule="auto"/>
     </w:pPr>
     <w:rPr>
       <w:sz w:val="20"/>
@@ -2418,7 +2418,7 @@
       <w:tabs>
         <w:tab w:val="clear" w:pos="1701"/>
       </w:tabs>
-      <w:spacing w:after="120" w:line="240" w:lineRule="atLeast"/>
+      <w:spacing w:after="102" w:line="204" w:lineRule="auto"/>
       <w:ind w:left="0" w:firstLine="0"/>
     </w:pPr>
     <w:rPr>

</xml_diff>

<commit_message>
Dokumenty: udaje firmy v zapati (a ve smluvnich stranach smlouvy, dodatku, protokolu) z Udaju firmy misto pevneho textu; pred kazdym vyplnenim sablony nove nacteni z databaze a kontrola proti ARES s upozornenim na rozdil, odkazy mailto/web podle aktualnich udaju
Co-Authored-By: Claude Opus 5.5 <noreply@anthropic.com>
</commit_message>
<xml_diff>
--- a/public/templates/dodatek_sablona.docx
+++ b/public/templates/dodatek_sablona.docx
@@ -101,13 +101,13 @@
                 <w:sz w:val="20"/>
                 <w:szCs w:val="20"/>
               </w:rPr>
-              <w:t xml:space="preserve">Jurenka elektro s.r.o.</w:t>
+              <w:t xml:space="preserve">{firmaNazev}</w:t>
               <w:br/>
-              <w:t xml:space="preserve">Riegrova 394/17, 779 00 Olomouc</w:t>
+              <w:t xml:space="preserve">{firmaUlice}, {firmaMesto}</w:t>
               <w:br/>
-              <w:t xml:space="preserve">IČO: 19147813, DIČ: CZ19147813</w:t>
+              <w:t xml:space="preserve">IČO: {firmaIco}, DIČ: {firmaDic}</w:t>
               <w:br/>
-              <w:t xml:space="preserve">Bankovní účet: 123-8729910267/0100</w:t>
+              <w:t xml:space="preserve">Bankovní účet: {firmaUcet}</w:t>
               <w:br/>
               <w:t xml:space="preserve">Zastoupený: {obchodnik}</w:t>
             </w:r>
@@ -601,7 +601,7 @@
               </w:rPr>
               <w:t xml:space="preserve">za zhotovitele</w:t>
               <w:br/>
-              <w:t xml:space="preserve">Jurenka elektro s.r.o.</w:t>
+              <w:t xml:space="preserve">{firmaNazev}</w:t>
             </w:r>
           </w:p>
         </w:tc>
@@ -789,14 +789,14 @@
         <w:rStyle w:val="Zdraznnintenzivn"/>
         <w:sz w:val="22"/>
       </w:rPr>
-      <w:t>Ju</w:t>
+      <w:t xml:space="preserve">{firmaNazev}</w:t>
     </w:r>
     <w:r>
       <w:rPr>
         <w:rStyle w:val="Zdraznnintenzivn"/>
         <w:sz w:val="22"/>
       </w:rPr>
-      <w:t>renka Elektro s.r.o.</w:t>
+      <w:t xml:space="preserve"/>
     </w:r>
     <w:r>
       <w:rPr>
@@ -815,7 +815,7 @@
           <w:color w:val="ED7D31" w:themeColor="accent2"/>
           <w:sz w:val="22"/>
         </w:rPr>
-        <w:t>www.jurenkaelektro.cz</w:t>
+        <w:t xml:space="preserve">{firmaWeb}</w:t>
       </w:r>
     </w:hyperlink>
   </w:p>
@@ -836,7 +836,7 @@
       <w:rPr>
         <w:sz w:val="22"/>
       </w:rPr>
-      <w:t>Riegrova 394/17,779 00 Olomouc, IČO: 19147813 | DIČ: CZ19147813</w:t>
+      <w:t xml:space="preserve">{firmaUlice}, {firmaMesto}, IČO: {firmaIco} | DIČ: {firmaDic}</w:t>
     </w:r>
   </w:p>
   <w:p>
@@ -860,7 +860,7 @@
         <w:rStyle w:val="Zdraznnjemn"/>
         <w:sz w:val="22"/>
       </w:rPr>
-      <w:t>+420 702 172 622</w:t>
+      <w:t xml:space="preserve">{firmaTelefon}</w:t>
     </w:r>
     <w:r>
       <w:rPr>
@@ -875,7 +875,7 @@
           <w:color w:val="ED7D31" w:themeColor="accent2"/>
           <w:sz w:val="22"/>
         </w:rPr>
-        <w:t>info@jurenkaelektro.cz</w:t>
+        <w:t xml:space="preserve">{firmaEmail}</w:t>
       </w:r>
     </w:hyperlink>
     <w:r>
@@ -892,7 +892,7 @@
       <w:fldChar w:fldCharType="separate"/>
     </w:r>
     <w:r>
-      <w:t>2</w:t>
+      <w:t xml:space="preserve">2</w:t>
     </w:r>
     <w:r>
       <w:fldChar w:fldCharType="end"/>
@@ -902,7 +902,7 @@
     </w:r>
     <w:fldSimple w:instr=" NUMPAGES   \* MERGEFORMAT ">
       <w:r>
-        <w:t>2</w:t>
+        <w:t xml:space="preserve">2</w:t>
       </w:r>
     </w:fldSimple>
   </w:p>

</xml_diff>